<commit_message>
edited Daily task tracker
</commit_message>
<xml_diff>
--- a/TFT_Daily_Task_Tracker.docx
+++ b/TFT_Daily_Task_Tracker.docx
@@ -279,8 +279,412 @@
       <w:pPr>
         <w:pStyle w:val="Heading1"/>
       </w:pPr>
+      <w:r>
+        <w:t>['NUM_FESTIVE_DAYS_MONTH',</w:t>
+      </w:r>
+    </w:p>
+    <w:p>
+      <w:pPr>
+        <w:pStyle w:val="Heading1"/>
+      </w:pPr>
+      <w:r>
+        <w:t xml:space="preserve"> 'FESTIVE_PHASE_I',</w:t>
+      </w:r>
+    </w:p>
+    <w:p>
+      <w:pPr>
+        <w:pStyle w:val="Heading1"/>
+      </w:pPr>
+      <w:r>
+        <w:t xml:space="preserve"> 'FESTIVE_PHASE_II',</w:t>
+      </w:r>
+    </w:p>
+    <w:p>
+      <w:pPr>
+        <w:pStyle w:val="Heading1"/>
+      </w:pPr>
+      <w:r>
+        <w:t xml:space="preserve"> 'FESTIVE_PHASE_III',</w:t>
+      </w:r>
+    </w:p>
+    <w:p>
+      <w:pPr>
+        <w:pStyle w:val="Heading1"/>
+      </w:pPr>
+      <w:r>
+        <w:t xml:space="preserve"> 'TOTAL_DAYS_FESTIVE_PHASE_I',</w:t>
+      </w:r>
+    </w:p>
+    <w:p>
+      <w:pPr>
+        <w:pStyle w:val="Heading1"/>
+      </w:pPr>
+      <w:r>
+        <w:t xml:space="preserve"> 'TOTAL_DAYS_FESTIVE_PHASE_II',</w:t>
+      </w:r>
+    </w:p>
+    <w:p>
+      <w:pPr>
+        <w:pStyle w:val="Heading1"/>
+      </w:pPr>
+      <w:r>
+        <w:t xml:space="preserve"> 'TOTAL_DAYS_FESTIVE_PHASE_III',</w:t>
+      </w:r>
+    </w:p>
+    <w:p>
+      <w:pPr>
+        <w:pStyle w:val="Heading1"/>
+      </w:pPr>
+      <w:r>
+        <w:t xml:space="preserve"> 'TOTAL_DAYS_PITRU_PAKSH',</w:t>
+      </w:r>
+    </w:p>
+    <w:p>
+      <w:pPr>
+        <w:pStyle w:val="Heading1"/>
+      </w:pPr>
+      <w:r>
+        <w:t xml:space="preserve"> 'PROP_FESTIVE_PHASE_I',</w:t>
+      </w:r>
+    </w:p>
+    <w:p>
+      <w:pPr>
+        <w:pStyle w:val="Heading1"/>
+      </w:pPr>
+      <w:r>
+        <w:t xml:space="preserve"> 'PROP_EVENT_FESTIVE_PHASE_I',</w:t>
+      </w:r>
+    </w:p>
+    <w:p>
+      <w:pPr>
+        <w:pStyle w:val="Heading1"/>
+      </w:pPr>
+      <w:r>
+        <w:t xml:space="preserve"> 'PROP_FESTIVE_PHASE_II',</w:t>
+      </w:r>
+    </w:p>
+    <w:p>
+      <w:pPr>
+        <w:pStyle w:val="Heading1"/>
+      </w:pPr>
+      <w:r>
+        <w:t xml:space="preserve"> 'PROP_EVENT_FESTIVE_PHASE_II',</w:t>
+      </w:r>
+    </w:p>
+    <w:p>
+      <w:pPr>
+        <w:pStyle w:val="Heading1"/>
+      </w:pPr>
+      <w:r>
+        <w:t xml:space="preserve"> 'PROP_FESTIVE_PHASE_III',</w:t>
+      </w:r>
+    </w:p>
+    <w:p>
+      <w:pPr>
+        <w:pStyle w:val="Heading1"/>
+      </w:pPr>
+      <w:r>
+        <w:t xml:space="preserve"> 'PROP_EVENT_FESTIVE_PHASE_III',</w:t>
+      </w:r>
+    </w:p>
+    <w:p>
+      <w:pPr>
+        <w:pStyle w:val="Heading1"/>
+      </w:pPr>
+      <w:r>
+        <w:t xml:space="preserve"> 'PROP_PITRU_PAKSH',</w:t>
+      </w:r>
+    </w:p>
+    <w:p>
+      <w:pPr>
+        <w:pStyle w:val="Heading1"/>
+      </w:pPr>
+      <w:r>
+        <w:t xml:space="preserve"> 'PROP_EVENT_PITRU_PAKSH',</w:t>
+      </w:r>
+    </w:p>
+    <w:p>
+      <w:pPr>
+        <w:pStyle w:val="Heading1"/>
+      </w:pPr>
+      <w:r>
+        <w:t xml:space="preserve"> 'AKSHAYA_TRITIYA_DAYS',</w:t>
+      </w:r>
+    </w:p>
+    <w:p>
+      <w:pPr>
+        <w:pStyle w:val="Heading1"/>
+      </w:pPr>
+      <w:r>
+        <w:lastRenderedPageBreak/>
+        <w:t xml:space="preserve"> 'BHAI_DOOJ_DAYS',</w:t>
+      </w:r>
+    </w:p>
+    <w:p>
+      <w:pPr>
+        <w:pStyle w:val="Heading1"/>
+      </w:pPr>
+      <w:r>
+        <w:t xml:space="preserve"> 'BUDDHA_PURNIMA_DAYS',</w:t>
+      </w:r>
+    </w:p>
+    <w:p>
+      <w:pPr>
+        <w:pStyle w:val="Heading1"/>
+      </w:pPr>
+      <w:r>
+        <w:t xml:space="preserve"> 'CHHATH_PUJA_DAYS',</w:t>
+      </w:r>
+    </w:p>
+    <w:p>
+      <w:pPr>
+        <w:pStyle w:val="Heading1"/>
+      </w:pPr>
+      <w:r>
+        <w:t xml:space="preserve"> 'DHANTERAS_DAYS',</w:t>
+      </w:r>
+    </w:p>
+    <w:p>
+      <w:pPr>
+        <w:pStyle w:val="Heading1"/>
+      </w:pPr>
+      <w:r>
+        <w:t xml:space="preserve"> 'DIWALI_DAYS',</w:t>
+      </w:r>
+    </w:p>
+    <w:p>
+      <w:pPr>
+        <w:pStyle w:val="Heading1"/>
+      </w:pPr>
+      <w:r>
+        <w:t xml:space="preserve"> 'DUSSEHRA</w:t>
+      </w:r>
+      <w:proofErr w:type="gramStart"/>
+      <w:r>
+        <w:t>_(</w:t>
+      </w:r>
+      <w:proofErr w:type="gramEnd"/>
+      <w:r>
+        <w:t>VIJAYADASHAMI)_DAYS',</w:t>
+      </w:r>
+    </w:p>
+    <w:p>
+      <w:pPr>
+        <w:pStyle w:val="Heading1"/>
+      </w:pPr>
+      <w:r>
+        <w:t xml:space="preserve"> 'EID_UL_FITR_DAYS',</w:t>
+      </w:r>
+    </w:p>
+    <w:p>
+      <w:pPr>
+        <w:pStyle w:val="Heading1"/>
+      </w:pPr>
+      <w:r>
+        <w:t xml:space="preserve"> 'GANESH_CHATURTHI_DAYS',</w:t>
+      </w:r>
+    </w:p>
+    <w:p>
+      <w:pPr>
+        <w:pStyle w:val="Heading1"/>
+      </w:pPr>
+      <w:r>
+        <w:t xml:space="preserve"> 'GANGA_DUSSEHRA_DAYS',</w:t>
+      </w:r>
+    </w:p>
+    <w:p>
+      <w:pPr>
+        <w:pStyle w:val="Heading1"/>
+      </w:pPr>
+      <w:r>
+        <w:t xml:space="preserve"> 'GOVARDHAN_POOJA_DAYS',</w:t>
+      </w:r>
+    </w:p>
+    <w:p>
+      <w:pPr>
+        <w:pStyle w:val="Heading1"/>
+      </w:pPr>
+      <w:r>
+        <w:t xml:space="preserve"> 'GURU_PURNIMA_DAYS',</w:t>
+      </w:r>
+    </w:p>
+    <w:p>
+      <w:pPr>
+        <w:pStyle w:val="Heading1"/>
+      </w:pPr>
+      <w:r>
+        <w:t xml:space="preserve"> 'HANUMAN_JAYANTI_DAYS',</w:t>
+      </w:r>
+    </w:p>
+    <w:p>
+      <w:pPr>
+        <w:pStyle w:val="Heading1"/>
+      </w:pPr>
+      <w:r>
+        <w:t xml:space="preserve"> 'HARTALIK_TEEJ_DAYS',</w:t>
+      </w:r>
+    </w:p>
+    <w:p>
+      <w:pPr>
+        <w:pStyle w:val="Heading1"/>
+      </w:pPr>
+      <w:r>
+        <w:t xml:space="preserve"> 'HOLI_DAYS',</w:t>
+      </w:r>
+    </w:p>
+    <w:p>
+      <w:pPr>
+        <w:pStyle w:val="Heading1"/>
+      </w:pPr>
+      <w:r>
+        <w:t xml:space="preserve"> 'HOLIKA_DAHAN_DAYS',</w:t>
+      </w:r>
+    </w:p>
+    <w:p>
+      <w:pPr>
+        <w:pStyle w:val="Heading1"/>
+      </w:pPr>
+      <w:r>
+        <w:t xml:space="preserve"> 'JAGANNATH_RATHYATRA_DAYS',</w:t>
+      </w:r>
+    </w:p>
+    <w:p>
+      <w:pPr>
+        <w:pStyle w:val="Heading1"/>
+      </w:pPr>
+      <w:r>
+        <w:t xml:space="preserve"> 'JANMASHTAMI_DAYS',</w:t>
+      </w:r>
+    </w:p>
+    <w:p>
+      <w:pPr>
+        <w:pStyle w:val="Heading1"/>
+      </w:pPr>
+      <w:r>
+        <w:t xml:space="preserve"> 'KARWA_CHAUTH_DAYS',</w:t>
+      </w:r>
+    </w:p>
+    <w:p>
+      <w:pPr>
+        <w:pStyle w:val="Heading1"/>
+      </w:pPr>
+      <w:r>
+        <w:t xml:space="preserve"> 'LOHRI_DAYS',</w:t>
+      </w:r>
+    </w:p>
+    <w:p>
+      <w:pPr>
+        <w:pStyle w:val="Heading1"/>
+      </w:pPr>
+      <w:r>
+        <w:t xml:space="preserve"> 'MAHA_SHIVARATRI_DAYS',</w:t>
+      </w:r>
+    </w:p>
+    <w:p>
+      <w:pPr>
+        <w:pStyle w:val="Heading1"/>
+      </w:pPr>
+      <w:r>
+        <w:t xml:space="preserve"> 'MAKAR_SANKRANTI_PONGAL_DAYS',</w:t>
+      </w:r>
+    </w:p>
+    <w:p>
+      <w:pPr>
+        <w:pStyle w:val="Heading1"/>
+      </w:pPr>
+      <w:r>
+        <w:t xml:space="preserve"> 'NAG_PANCHAMI_DAYS',</w:t>
+      </w:r>
+    </w:p>
+    <w:p>
+      <w:pPr>
+        <w:pStyle w:val="Heading1"/>
+      </w:pPr>
+      <w:r>
+        <w:lastRenderedPageBreak/>
+        <w:t xml:space="preserve"> 'NAVRATRI_DAYS',</w:t>
+      </w:r>
+    </w:p>
+    <w:p>
+      <w:pPr>
+        <w:pStyle w:val="Heading1"/>
+      </w:pPr>
+      <w:r>
+        <w:t xml:space="preserve"> 'NEW_YEAR_DAYS',</w:t>
+      </w:r>
+    </w:p>
+    <w:p>
+      <w:pPr>
+        <w:pStyle w:val="Heading1"/>
+      </w:pPr>
+      <w:r>
+        <w:t xml:space="preserve"> 'ONAM_DAYS',</w:t>
+      </w:r>
+    </w:p>
+    <w:p>
+      <w:pPr>
+        <w:pStyle w:val="Heading1"/>
+      </w:pPr>
+      <w:r>
+        <w:t xml:space="preserve"> 'PITRAPAKSHA_DAYS',</w:t>
+      </w:r>
+    </w:p>
+    <w:p>
+      <w:pPr>
+        <w:pStyle w:val="Heading1"/>
+      </w:pPr>
+      <w:r>
+        <w:t xml:space="preserve"> 'RAKSHA_BANDHAN_DAYS',</w:t>
+      </w:r>
+    </w:p>
+    <w:p>
+      <w:pPr>
+        <w:pStyle w:val="Heading1"/>
+      </w:pPr>
+      <w:r>
+        <w:t xml:space="preserve"> 'REPUBLIC_DAY_DAYS',</w:t>
+      </w:r>
+    </w:p>
+    <w:p>
+      <w:pPr>
+        <w:pStyle w:val="Heading1"/>
+      </w:pPr>
+      <w:r>
+        <w:t xml:space="preserve"> 'VASANT_PANCHAMI_DAYS',</w:t>
+      </w:r>
+    </w:p>
+    <w:p>
+      <w:pPr>
+        <w:pStyle w:val="Heading1"/>
+      </w:pPr>
+      <w:r>
+        <w:t xml:space="preserve"> 'VISHWAKARMA_PUJA_DAYS',</w:t>
+      </w:r>
+    </w:p>
+    <w:p>
+      <w:pPr>
+        <w:pStyle w:val="Heading1"/>
+      </w:pPr>
+      <w:r>
+        <w:t xml:space="preserve"> 'MARRIAGE_DAYS']</w:t>
+      </w:r>
       <w:bookmarkStart w:id="0" w:name="_GoBack"/>
       <w:bookmarkEnd w:id="0"/>
+    </w:p>
+    <w:p>
+      <w:pPr>
+        <w:pStyle w:val="Heading1"/>
+      </w:pPr>
+    </w:p>
+    <w:p>
+      <w:pPr>
+        <w:pStyle w:val="Heading1"/>
+      </w:pPr>
+    </w:p>
+    <w:p>
+      <w:pPr>
+        <w:pStyle w:val="Heading1"/>
+      </w:pPr>
     </w:p>
     <w:p>
       <w:pPr>
@@ -349,12 +753,6 @@
         <w:gridCol w:w="8760"/>
       </w:tblGrid>
       <w:tr>
-        <w:tblPrEx>
-          <w:tblCellMar>
-            <w:top w:w="0" w:type="dxa"/>
-            <w:bottom w:w="0" w:type="dxa"/>
-          </w:tblCellMar>
-        </w:tblPrEx>
         <w:tc>
           <w:tcPr>
             <w:tcW w:w="9360" w:type="dxa"/>
@@ -388,12 +786,6 @@
         </w:tc>
       </w:tr>
       <w:tr>
-        <w:tblPrEx>
-          <w:tblCellMar>
-            <w:top w:w="0" w:type="dxa"/>
-            <w:bottom w:w="0" w:type="dxa"/>
-          </w:tblCellMar>
-        </w:tblPrEx>
         <w:tc>
           <w:tcPr>
             <w:tcW w:w="600" w:type="dxa"/>
@@ -450,12 +842,6 @@
         </w:tc>
       </w:tr>
       <w:tr>
-        <w:tblPrEx>
-          <w:tblCellMar>
-            <w:top w:w="0" w:type="dxa"/>
-            <w:bottom w:w="0" w:type="dxa"/>
-          </w:tblCellMar>
-        </w:tblPrEx>
         <w:tc>
           <w:tcPr>
             <w:tcW w:w="600" w:type="dxa"/>
@@ -512,12 +898,6 @@
         </w:tc>
       </w:tr>
       <w:tr>
-        <w:tblPrEx>
-          <w:tblCellMar>
-            <w:top w:w="0" w:type="dxa"/>
-            <w:bottom w:w="0" w:type="dxa"/>
-          </w:tblCellMar>
-        </w:tblPrEx>
         <w:tc>
           <w:tcPr>
             <w:tcW w:w="600" w:type="dxa"/>
@@ -574,12 +954,6 @@
         </w:tc>
       </w:tr>
       <w:tr>
-        <w:tblPrEx>
-          <w:tblCellMar>
-            <w:top w:w="0" w:type="dxa"/>
-            <w:bottom w:w="0" w:type="dxa"/>
-          </w:tblCellMar>
-        </w:tblPrEx>
         <w:tc>
           <w:tcPr>
             <w:tcW w:w="600" w:type="dxa"/>
@@ -636,12 +1010,6 @@
         </w:tc>
       </w:tr>
       <w:tr>
-        <w:tblPrEx>
-          <w:tblCellMar>
-            <w:top w:w="0" w:type="dxa"/>
-            <w:bottom w:w="0" w:type="dxa"/>
-          </w:tblCellMar>
-        </w:tblPrEx>
         <w:tc>
           <w:tcPr>
             <w:tcW w:w="600" w:type="dxa"/>
@@ -710,12 +1078,6 @@
         </w:tc>
       </w:tr>
       <w:tr>
-        <w:tblPrEx>
-          <w:tblCellMar>
-            <w:top w:w="0" w:type="dxa"/>
-            <w:bottom w:w="0" w:type="dxa"/>
-          </w:tblCellMar>
-        </w:tblPrEx>
         <w:tc>
           <w:tcPr>
             <w:tcW w:w="600" w:type="dxa"/>
@@ -772,12 +1134,6 @@
         </w:tc>
       </w:tr>
       <w:tr>
-        <w:tblPrEx>
-          <w:tblCellMar>
-            <w:top w:w="0" w:type="dxa"/>
-            <w:bottom w:w="0" w:type="dxa"/>
-          </w:tblCellMar>
-        </w:tblPrEx>
         <w:tc>
           <w:tcPr>
             <w:tcW w:w="600" w:type="dxa"/>
@@ -834,12 +1190,6 @@
         </w:tc>
       </w:tr>
       <w:tr>
-        <w:tblPrEx>
-          <w:tblCellMar>
-            <w:top w:w="0" w:type="dxa"/>
-            <w:bottom w:w="0" w:type="dxa"/>
-          </w:tblCellMar>
-        </w:tblPrEx>
         <w:tc>
           <w:tcPr>
             <w:tcW w:w="600" w:type="dxa"/>
@@ -896,12 +1246,6 @@
         </w:tc>
       </w:tr>
       <w:tr>
-        <w:tblPrEx>
-          <w:tblCellMar>
-            <w:top w:w="0" w:type="dxa"/>
-            <w:bottom w:w="0" w:type="dxa"/>
-          </w:tblCellMar>
-        </w:tblPrEx>
         <w:tc>
           <w:tcPr>
             <w:tcW w:w="9360" w:type="dxa"/>
@@ -935,12 +1279,6 @@
         </w:tc>
       </w:tr>
       <w:tr>
-        <w:tblPrEx>
-          <w:tblCellMar>
-            <w:top w:w="0" w:type="dxa"/>
-            <w:bottom w:w="0" w:type="dxa"/>
-          </w:tblCellMar>
-        </w:tblPrEx>
         <w:tc>
           <w:tcPr>
             <w:tcW w:w="600" w:type="dxa"/>
@@ -997,12 +1335,6 @@
         </w:tc>
       </w:tr>
       <w:tr>
-        <w:tblPrEx>
-          <w:tblCellMar>
-            <w:top w:w="0" w:type="dxa"/>
-            <w:bottom w:w="0" w:type="dxa"/>
-          </w:tblCellMar>
-        </w:tblPrEx>
         <w:tc>
           <w:tcPr>
             <w:tcW w:w="600" w:type="dxa"/>
@@ -1030,6 +1362,7 @@
                 <w:sz w:val="22"/>
                 <w:szCs w:val="22"/>
               </w:rPr>
+              <w:lastRenderedPageBreak/>
               <w:t>☐</w:t>
             </w:r>
           </w:p>
@@ -1059,12 +1392,6 @@
         </w:tc>
       </w:tr>
       <w:tr>
-        <w:tblPrEx>
-          <w:tblCellMar>
-            <w:top w:w="0" w:type="dxa"/>
-            <w:bottom w:w="0" w:type="dxa"/>
-          </w:tblCellMar>
-        </w:tblPrEx>
         <w:tc>
           <w:tcPr>
             <w:tcW w:w="600" w:type="dxa"/>
@@ -1133,12 +1460,6 @@
         </w:tc>
       </w:tr>
       <w:tr>
-        <w:tblPrEx>
-          <w:tblCellMar>
-            <w:top w:w="0" w:type="dxa"/>
-            <w:bottom w:w="0" w:type="dxa"/>
-          </w:tblCellMar>
-        </w:tblPrEx>
         <w:tc>
           <w:tcPr>
             <w:tcW w:w="600" w:type="dxa"/>
@@ -1201,8 +1522,515 @@
                 <w:sz w:val="17"/>
                 <w:szCs w:val="17"/>
               </w:rPr>
-              <w:t>Opti</w:t>
-            </w:r>
+              <w:t>Optional but semantically richer than the binary flag</w:t>
+            </w:r>
+          </w:p>
+        </w:tc>
+      </w:tr>
+      <w:tr>
+        <w:tc>
+          <w:tcPr>
+            <w:tcW w:w="600" w:type="dxa"/>
+            <w:tcBorders>
+              <w:top w:val="single" w:sz="1" w:space="0" w:color="CCCCCC"/>
+              <w:left w:val="single" w:sz="1" w:space="0" w:color="CCCCCC"/>
+              <w:bottom w:val="single" w:sz="1" w:space="0" w:color="CCCCCC"/>
+              <w:right w:val="single" w:sz="1" w:space="0" w:color="CCCCCC"/>
+            </w:tcBorders>
+            <w:shd w:val="clear" w:color="auto" w:fill="FFFFFF"/>
+            <w:tcMar>
+              <w:top w:w="60" w:type="dxa"/>
+              <w:left w:w="100" w:type="dxa"/>
+              <w:bottom w:w="60" w:type="dxa"/>
+              <w:right w:w="100" w:type="dxa"/>
+            </w:tcMar>
+            <w:vAlign w:val="center"/>
+          </w:tcPr>
+          <w:p>
+            <w:pPr>
+              <w:jc w:val="center"/>
+            </w:pPr>
+            <w:r>
+              <w:rPr>
+                <w:sz w:val="22"/>
+                <w:szCs w:val="22"/>
+              </w:rPr>
+              <w:t>☐</w:t>
+            </w:r>
+          </w:p>
+        </w:tc>
+        <w:tc>
+          <w:tcPr>
+            <w:tcW w:w="8760" w:type="dxa"/>
+            <w:tcBorders>
+              <w:top w:val="single" w:sz="1" w:space="0" w:color="CCCCCC"/>
+              <w:left w:val="single" w:sz="1" w:space="0" w:color="CCCCCC"/>
+              <w:bottom w:val="single" w:sz="1" w:space="0" w:color="CCCCCC"/>
+              <w:right w:val="single" w:sz="1" w:space="0" w:color="CCCCCC"/>
+            </w:tcBorders>
+            <w:shd w:val="clear" w:color="auto" w:fill="FFFFFF"/>
+            <w:tcMar>
+              <w:top w:w="60" w:type="dxa"/>
+              <w:left w:w="120" w:type="dxa"/>
+              <w:bottom w:w="60" w:type="dxa"/>
+              <w:right w:w="120" w:type="dxa"/>
+            </w:tcMar>
+          </w:tcPr>
+          <w:p>
+            <w:r>
+              <w:t>Retain existing future covariates: Cyclic Month, Relative Position, Year, Days in Month, Holiday indicators</w:t>
+            </w:r>
+          </w:p>
+        </w:tc>
+      </w:tr>
+      <w:tr>
+        <w:tc>
+          <w:tcPr>
+            <w:tcW w:w="600" w:type="dxa"/>
+            <w:tcBorders>
+              <w:top w:val="single" w:sz="1" w:space="0" w:color="CCCCCC"/>
+              <w:left w:val="single" w:sz="1" w:space="0" w:color="CCCCCC"/>
+              <w:bottom w:val="single" w:sz="1" w:space="0" w:color="CCCCCC"/>
+              <w:right w:val="single" w:sz="1" w:space="0" w:color="CCCCCC"/>
+            </w:tcBorders>
+            <w:shd w:val="clear" w:color="auto" w:fill="FFFFFF"/>
+            <w:tcMar>
+              <w:top w:w="60" w:type="dxa"/>
+              <w:left w:w="100" w:type="dxa"/>
+              <w:bottom w:w="60" w:type="dxa"/>
+              <w:right w:w="100" w:type="dxa"/>
+            </w:tcMar>
+            <w:vAlign w:val="center"/>
+          </w:tcPr>
+          <w:p>
+            <w:pPr>
+              <w:jc w:val="center"/>
+            </w:pPr>
+            <w:r>
+              <w:rPr>
+                <w:sz w:val="22"/>
+                <w:szCs w:val="22"/>
+              </w:rPr>
+              <w:t>☐</w:t>
+            </w:r>
+          </w:p>
+        </w:tc>
+        <w:tc>
+          <w:tcPr>
+            <w:tcW w:w="8760" w:type="dxa"/>
+            <w:tcBorders>
+              <w:top w:val="single" w:sz="1" w:space="0" w:color="CCCCCC"/>
+              <w:left w:val="single" w:sz="1" w:space="0" w:color="CCCCCC"/>
+              <w:bottom w:val="single" w:sz="1" w:space="0" w:color="CCCCCC"/>
+              <w:right w:val="single" w:sz="1" w:space="0" w:color="CCCCCC"/>
+            </w:tcBorders>
+            <w:shd w:val="clear" w:color="auto" w:fill="FFFFFF"/>
+            <w:tcMar>
+              <w:top w:w="60" w:type="dxa"/>
+              <w:left w:w="120" w:type="dxa"/>
+              <w:bottom w:w="60" w:type="dxa"/>
+              <w:right w:w="120" w:type="dxa"/>
+            </w:tcMar>
+          </w:tcPr>
+          <w:p>
+            <w:r>
+              <w:t>Retain existing static covariates: geographic metadata, bike specs, dealer IDs</w:t>
+            </w:r>
+          </w:p>
+        </w:tc>
+      </w:tr>
+      <w:tr>
+        <w:tc>
+          <w:tcPr>
+            <w:tcW w:w="600" w:type="dxa"/>
+            <w:tcBorders>
+              <w:top w:val="single" w:sz="1" w:space="0" w:color="CCCCCC"/>
+              <w:left w:val="single" w:sz="1" w:space="0" w:color="CCCCCC"/>
+              <w:bottom w:val="single" w:sz="1" w:space="0" w:color="CCCCCC"/>
+              <w:right w:val="single" w:sz="1" w:space="0" w:color="CCCCCC"/>
+            </w:tcBorders>
+            <w:shd w:val="clear" w:color="auto" w:fill="FFFFFF"/>
+            <w:tcMar>
+              <w:top w:w="60" w:type="dxa"/>
+              <w:left w:w="100" w:type="dxa"/>
+              <w:bottom w:w="60" w:type="dxa"/>
+              <w:right w:w="100" w:type="dxa"/>
+            </w:tcMar>
+            <w:vAlign w:val="center"/>
+          </w:tcPr>
+          <w:p>
+            <w:pPr>
+              <w:jc w:val="center"/>
+            </w:pPr>
+            <w:r>
+              <w:rPr>
+                <w:sz w:val="22"/>
+                <w:szCs w:val="22"/>
+              </w:rPr>
+              <w:t>☐</w:t>
+            </w:r>
+          </w:p>
+        </w:tc>
+        <w:tc>
+          <w:tcPr>
+            <w:tcW w:w="8760" w:type="dxa"/>
+            <w:tcBorders>
+              <w:top w:val="single" w:sz="1" w:space="0" w:color="CCCCCC"/>
+              <w:left w:val="single" w:sz="1" w:space="0" w:color="CCCCCC"/>
+              <w:bottom w:val="single" w:sz="1" w:space="0" w:color="CCCCCC"/>
+              <w:right w:val="single" w:sz="1" w:space="0" w:color="CCCCCC"/>
+            </w:tcBorders>
+            <w:shd w:val="clear" w:color="auto" w:fill="FFFFFF"/>
+            <w:tcMar>
+              <w:top w:w="60" w:type="dxa"/>
+              <w:left w:w="120" w:type="dxa"/>
+              <w:bottom w:w="60" w:type="dxa"/>
+              <w:right w:w="120" w:type="dxa"/>
+            </w:tcMar>
+          </w:tcPr>
+          <w:p>
+            <w:r>
+              <w:t>Verify covariate coverage extends through the full forecast horizon (Mar'26)</w:t>
+            </w:r>
+          </w:p>
+        </w:tc>
+      </w:tr>
+      <w:tr>
+        <w:tc>
+          <w:tcPr>
+            <w:tcW w:w="9360" w:type="dxa"/>
+            <w:gridSpan w:val="2"/>
+            <w:tcBorders>
+              <w:top w:val="single" w:sz="1" w:space="0" w:color="CCCCCC"/>
+              <w:left w:val="single" w:sz="1" w:space="0" w:color="CCCCCC"/>
+              <w:bottom w:val="single" w:sz="1" w:space="0" w:color="CCCCCC"/>
+              <w:right w:val="single" w:sz="1" w:space="0" w:color="CCCCCC"/>
+            </w:tcBorders>
+            <w:shd w:val="clear" w:color="auto" w:fill="2E75B6"/>
+            <w:tcMar>
+              <w:top w:w="80" w:type="dxa"/>
+              <w:left w:w="140" w:type="dxa"/>
+              <w:bottom w:w="80" w:type="dxa"/>
+              <w:right w:w="140" w:type="dxa"/>
+            </w:tcMar>
+          </w:tcPr>
+          <w:p>
+            <w:r>
+              <w:rPr>
+                <w:b/>
+                <w:bCs/>
+                <w:color w:val="FFFFFF"/>
+                <w:sz w:val="22"/>
+                <w:szCs w:val="22"/>
+              </w:rPr>
+              <w:t>Phase 3 — Model Training</w:t>
+            </w:r>
+          </w:p>
+        </w:tc>
+      </w:tr>
+      <w:tr>
+        <w:tc>
+          <w:tcPr>
+            <w:tcW w:w="600" w:type="dxa"/>
+            <w:tcBorders>
+              <w:top w:val="single" w:sz="1" w:space="0" w:color="CCCCCC"/>
+              <w:left w:val="single" w:sz="1" w:space="0" w:color="CCCCCC"/>
+              <w:bottom w:val="single" w:sz="1" w:space="0" w:color="CCCCCC"/>
+              <w:right w:val="single" w:sz="1" w:space="0" w:color="CCCCCC"/>
+            </w:tcBorders>
+            <w:shd w:val="clear" w:color="auto" w:fill="FFFFFF"/>
+            <w:tcMar>
+              <w:top w:w="60" w:type="dxa"/>
+              <w:left w:w="100" w:type="dxa"/>
+              <w:bottom w:w="60" w:type="dxa"/>
+              <w:right w:w="100" w:type="dxa"/>
+            </w:tcMar>
+            <w:vAlign w:val="center"/>
+          </w:tcPr>
+          <w:p>
+            <w:pPr>
+              <w:jc w:val="center"/>
+            </w:pPr>
+            <w:r>
+              <w:rPr>
+                <w:sz w:val="22"/>
+                <w:szCs w:val="22"/>
+              </w:rPr>
+              <w:t>☐</w:t>
+            </w:r>
+          </w:p>
+        </w:tc>
+        <w:tc>
+          <w:tcPr>
+            <w:tcW w:w="8760" w:type="dxa"/>
+            <w:tcBorders>
+              <w:top w:val="single" w:sz="1" w:space="0" w:color="CCCCCC"/>
+              <w:left w:val="single" w:sz="1" w:space="0" w:color="CCCCCC"/>
+              <w:bottom w:val="single" w:sz="1" w:space="0" w:color="CCCCCC"/>
+              <w:right w:val="single" w:sz="1" w:space="0" w:color="CCCCCC"/>
+            </w:tcBorders>
+            <w:shd w:val="clear" w:color="auto" w:fill="FFFFFF"/>
+            <w:tcMar>
+              <w:top w:w="60" w:type="dxa"/>
+              <w:left w:w="120" w:type="dxa"/>
+              <w:bottom w:w="60" w:type="dxa"/>
+              <w:right w:w="120" w:type="dxa"/>
+            </w:tcMar>
+          </w:tcPr>
+          <w:p>
+            <w:r>
+              <w:t>Configure Darts TFT with architecture from overfitting test (hidden size, LSTM layers, attention heads)</w:t>
+            </w:r>
+          </w:p>
+        </w:tc>
+      </w:tr>
+      <w:tr>
+        <w:tc>
+          <w:tcPr>
+            <w:tcW w:w="600" w:type="dxa"/>
+            <w:tcBorders>
+              <w:top w:val="single" w:sz="1" w:space="0" w:color="CCCCCC"/>
+              <w:left w:val="single" w:sz="1" w:space="0" w:color="CCCCCC"/>
+              <w:bottom w:val="single" w:sz="1" w:space="0" w:color="CCCCCC"/>
+              <w:right w:val="single" w:sz="1" w:space="0" w:color="CCCCCC"/>
+            </w:tcBorders>
+            <w:shd w:val="clear" w:color="auto" w:fill="FFFFFF"/>
+            <w:tcMar>
+              <w:top w:w="60" w:type="dxa"/>
+              <w:left w:w="100" w:type="dxa"/>
+              <w:bottom w:w="60" w:type="dxa"/>
+              <w:right w:w="100" w:type="dxa"/>
+            </w:tcMar>
+            <w:vAlign w:val="center"/>
+          </w:tcPr>
+          <w:p>
+            <w:pPr>
+              <w:jc w:val="center"/>
+            </w:pPr>
+            <w:r>
+              <w:rPr>
+                <w:sz w:val="22"/>
+                <w:szCs w:val="22"/>
+              </w:rPr>
+              <w:t>☐</w:t>
+            </w:r>
+          </w:p>
+        </w:tc>
+        <w:tc>
+          <w:tcPr>
+            <w:tcW w:w="8760" w:type="dxa"/>
+            <w:tcBorders>
+              <w:top w:val="single" w:sz="1" w:space="0" w:color="CCCCCC"/>
+              <w:left w:val="single" w:sz="1" w:space="0" w:color="CCCCCC"/>
+              <w:bottom w:val="single" w:sz="1" w:space="0" w:color="CCCCCC"/>
+              <w:right w:val="single" w:sz="1" w:space="0" w:color="CCCCCC"/>
+            </w:tcBorders>
+            <w:shd w:val="clear" w:color="auto" w:fill="FFFFFF"/>
+            <w:tcMar>
+              <w:top w:w="60" w:type="dxa"/>
+              <w:left w:w="120" w:type="dxa"/>
+              <w:bottom w:w="60" w:type="dxa"/>
+              <w:right w:w="120" w:type="dxa"/>
+            </w:tcMar>
+          </w:tcPr>
+          <w:p>
+            <w:r>
+              <w:t>Set learning rate to ~0.0003 (validated in overfitting test with holiday covariates)</w:t>
+            </w:r>
+          </w:p>
+        </w:tc>
+      </w:tr>
+      <w:tr>
+        <w:tc>
+          <w:tcPr>
+            <w:tcW w:w="600" w:type="dxa"/>
+            <w:tcBorders>
+              <w:top w:val="single" w:sz="1" w:space="0" w:color="CCCCCC"/>
+              <w:left w:val="single" w:sz="1" w:space="0" w:color="CCCCCC"/>
+              <w:bottom w:val="single" w:sz="1" w:space="0" w:color="CCCCCC"/>
+              <w:right w:val="single" w:sz="1" w:space="0" w:color="CCCCCC"/>
+            </w:tcBorders>
+            <w:shd w:val="clear" w:color="auto" w:fill="FFFFFF"/>
+            <w:tcMar>
+              <w:top w:w="60" w:type="dxa"/>
+              <w:left w:w="100" w:type="dxa"/>
+              <w:bottom w:w="60" w:type="dxa"/>
+              <w:right w:w="100" w:type="dxa"/>
+            </w:tcMar>
+            <w:vAlign w:val="center"/>
+          </w:tcPr>
+          <w:p>
+            <w:pPr>
+              <w:jc w:val="center"/>
+            </w:pPr>
+            <w:r>
+              <w:rPr>
+                <w:sz w:val="22"/>
+                <w:szCs w:val="22"/>
+              </w:rPr>
+              <w:t>☐</w:t>
+            </w:r>
+          </w:p>
+        </w:tc>
+        <w:tc>
+          <w:tcPr>
+            <w:tcW w:w="8760" w:type="dxa"/>
+            <w:tcBorders>
+              <w:top w:val="single" w:sz="1" w:space="0" w:color="CCCCCC"/>
+              <w:left w:val="single" w:sz="1" w:space="0" w:color="CCCCCC"/>
+              <w:bottom w:val="single" w:sz="1" w:space="0" w:color="CCCCCC"/>
+              <w:right w:val="single" w:sz="1" w:space="0" w:color="CCCCCC"/>
+            </w:tcBorders>
+            <w:shd w:val="clear" w:color="auto" w:fill="FFFFFF"/>
+            <w:tcMar>
+              <w:top w:w="60" w:type="dxa"/>
+              <w:left w:w="120" w:type="dxa"/>
+              <w:bottom w:w="60" w:type="dxa"/>
+              <w:right w:w="120" w:type="dxa"/>
+            </w:tcMar>
+          </w:tcPr>
+          <w:p>
+            <w:r>
+              <w:t xml:space="preserve">Enable </w:t>
+            </w:r>
+            <w:proofErr w:type="spellStart"/>
+            <w:r>
+              <w:t>AdamW</w:t>
+            </w:r>
+            <w:proofErr w:type="spellEnd"/>
+            <w:r>
+              <w:t xml:space="preserve"> optimizer and Early Stopping (as validated in overfitting test)</w:t>
+            </w:r>
+          </w:p>
+        </w:tc>
+      </w:tr>
+      <w:tr>
+        <w:tc>
+          <w:tcPr>
+            <w:tcW w:w="600" w:type="dxa"/>
+            <w:tcBorders>
+              <w:top w:val="single" w:sz="1" w:space="0" w:color="CCCCCC"/>
+              <w:left w:val="single" w:sz="1" w:space="0" w:color="CCCCCC"/>
+              <w:bottom w:val="single" w:sz="1" w:space="0" w:color="CCCCCC"/>
+              <w:right w:val="single" w:sz="1" w:space="0" w:color="CCCCCC"/>
+            </w:tcBorders>
+            <w:shd w:val="clear" w:color="auto" w:fill="FFFFFF"/>
+            <w:tcMar>
+              <w:top w:w="60" w:type="dxa"/>
+              <w:left w:w="100" w:type="dxa"/>
+              <w:bottom w:w="60" w:type="dxa"/>
+              <w:right w:w="100" w:type="dxa"/>
+            </w:tcMar>
+            <w:vAlign w:val="center"/>
+          </w:tcPr>
+          <w:p>
+            <w:pPr>
+              <w:jc w:val="center"/>
+            </w:pPr>
+            <w:r>
+              <w:rPr>
+                <w:sz w:val="22"/>
+                <w:szCs w:val="22"/>
+              </w:rPr>
+              <w:t>☐</w:t>
+            </w:r>
+          </w:p>
+        </w:tc>
+        <w:tc>
+          <w:tcPr>
+            <w:tcW w:w="8760" w:type="dxa"/>
+            <w:tcBorders>
+              <w:top w:val="single" w:sz="1" w:space="0" w:color="CCCCCC"/>
+              <w:left w:val="single" w:sz="1" w:space="0" w:color="CCCCCC"/>
+              <w:bottom w:val="single" w:sz="1" w:space="0" w:color="CCCCCC"/>
+              <w:right w:val="single" w:sz="1" w:space="0" w:color="CCCCCC"/>
+            </w:tcBorders>
+            <w:shd w:val="clear" w:color="auto" w:fill="FFFFFF"/>
+            <w:tcMar>
+              <w:top w:w="60" w:type="dxa"/>
+              <w:left w:w="120" w:type="dxa"/>
+              <w:bottom w:w="60" w:type="dxa"/>
+              <w:right w:w="120" w:type="dxa"/>
+            </w:tcMar>
+          </w:tcPr>
+          <w:p>
+            <w:r>
+              <w:t>Train model on filtered series with all covariates including GST indicator</w:t>
+            </w:r>
+          </w:p>
+        </w:tc>
+      </w:tr>
+      <w:tr>
+        <w:tc>
+          <w:tcPr>
+            <w:tcW w:w="600" w:type="dxa"/>
+            <w:tcBorders>
+              <w:top w:val="single" w:sz="1" w:space="0" w:color="CCCCCC"/>
+              <w:left w:val="single" w:sz="1" w:space="0" w:color="CCCCCC"/>
+              <w:bottom w:val="single" w:sz="1" w:space="0" w:color="CCCCCC"/>
+              <w:right w:val="single" w:sz="1" w:space="0" w:color="CCCCCC"/>
+            </w:tcBorders>
+            <w:shd w:val="clear" w:color="auto" w:fill="FFFFFF"/>
+            <w:tcMar>
+              <w:top w:w="60" w:type="dxa"/>
+              <w:left w:w="100" w:type="dxa"/>
+              <w:bottom w:w="60" w:type="dxa"/>
+              <w:right w:w="100" w:type="dxa"/>
+            </w:tcMar>
+            <w:vAlign w:val="center"/>
+          </w:tcPr>
+          <w:p>
+            <w:pPr>
+              <w:jc w:val="center"/>
+            </w:pPr>
+            <w:r>
+              <w:rPr>
+                <w:sz w:val="22"/>
+                <w:szCs w:val="22"/>
+              </w:rPr>
+              <w:t>☐</w:t>
+            </w:r>
+          </w:p>
+        </w:tc>
+        <w:tc>
+          <w:tcPr>
+            <w:tcW w:w="8760" w:type="dxa"/>
+            <w:tcBorders>
+              <w:top w:val="single" w:sz="1" w:space="0" w:color="CCCCCC"/>
+              <w:left w:val="single" w:sz="1" w:space="0" w:color="CCCCCC"/>
+              <w:bottom w:val="single" w:sz="1" w:space="0" w:color="CCCCCC"/>
+              <w:right w:val="single" w:sz="1" w:space="0" w:color="CCCCCC"/>
+            </w:tcBorders>
+            <w:shd w:val="clear" w:color="auto" w:fill="FFFFFF"/>
+            <w:tcMar>
+              <w:top w:w="60" w:type="dxa"/>
+              <w:left w:w="120" w:type="dxa"/>
+              <w:bottom w:w="60" w:type="dxa"/>
+              <w:right w:w="120" w:type="dxa"/>
+            </w:tcMar>
+          </w:tcPr>
+          <w:p>
+            <w:r>
+              <w:t xml:space="preserve">Monitor </w:t>
+            </w:r>
+            <w:proofErr w:type="spellStart"/>
+            <w:r>
+              <w:t>train_loss</w:t>
+            </w:r>
+            <w:proofErr w:type="spellEnd"/>
+            <w:r>
+              <w:t xml:space="preserve"> and </w:t>
+            </w:r>
+            <w:proofErr w:type="spellStart"/>
+            <w:r>
+              <w:t>val_loss</w:t>
+            </w:r>
+            <w:proofErr w:type="spellEnd"/>
+            <w:r>
+              <w:t xml:space="preserve"> — ensure both decrease together; watch for widening gap (overfitting signal)</w:t>
+            </w:r>
+          </w:p>
+          <w:p>
             <w:r>
               <w:rPr>
                 <w:i/>
@@ -1211,18 +2039,12 @@
                 <w:sz w:val="17"/>
                 <w:szCs w:val="17"/>
               </w:rPr>
-              <w:t>onal but semantically richer than the binary flag</w:t>
+              <w:t>Val loss may be elevated due to anomalous Dec'25–Feb'26 window — interpret with care</w:t>
             </w:r>
           </w:p>
         </w:tc>
       </w:tr>
       <w:tr>
-        <w:tblPrEx>
-          <w:tblCellMar>
-            <w:top w:w="0" w:type="dxa"/>
-            <w:bottom w:w="0" w:type="dxa"/>
-          </w:tblCellMar>
-        </w:tblPrEx>
         <w:tc>
           <w:tcPr>
             <w:tcW w:w="600" w:type="dxa"/>
@@ -1273,142 +2095,20 @@
           </w:tcPr>
           <w:p>
             <w:r>
-              <w:t>Retain existing future covariates: Cyclic Month, Relative Position, Year, Days in Month, Holiday indicators</w:t>
+              <w:t xml:space="preserve">Save best checkpoint (lowest </w:t>
+            </w:r>
+            <w:proofErr w:type="spellStart"/>
+            <w:r>
+              <w:t>val_loss</w:t>
+            </w:r>
+            <w:proofErr w:type="spellEnd"/>
+            <w:r>
+              <w:t xml:space="preserve"> epoch)</w:t>
             </w:r>
           </w:p>
         </w:tc>
       </w:tr>
       <w:tr>
-        <w:tblPrEx>
-          <w:tblCellMar>
-            <w:top w:w="0" w:type="dxa"/>
-            <w:bottom w:w="0" w:type="dxa"/>
-          </w:tblCellMar>
-        </w:tblPrEx>
-        <w:tc>
-          <w:tcPr>
-            <w:tcW w:w="600" w:type="dxa"/>
-            <w:tcBorders>
-              <w:top w:val="single" w:sz="1" w:space="0" w:color="CCCCCC"/>
-              <w:left w:val="single" w:sz="1" w:space="0" w:color="CCCCCC"/>
-              <w:bottom w:val="single" w:sz="1" w:space="0" w:color="CCCCCC"/>
-              <w:right w:val="single" w:sz="1" w:space="0" w:color="CCCCCC"/>
-            </w:tcBorders>
-            <w:shd w:val="clear" w:color="auto" w:fill="FFFFFF"/>
-            <w:tcMar>
-              <w:top w:w="60" w:type="dxa"/>
-              <w:left w:w="100" w:type="dxa"/>
-              <w:bottom w:w="60" w:type="dxa"/>
-              <w:right w:w="100" w:type="dxa"/>
-            </w:tcMar>
-            <w:vAlign w:val="center"/>
-          </w:tcPr>
-          <w:p>
-            <w:pPr>
-              <w:jc w:val="center"/>
-            </w:pPr>
-            <w:r>
-              <w:rPr>
-                <w:sz w:val="22"/>
-                <w:szCs w:val="22"/>
-              </w:rPr>
-              <w:t>☐</w:t>
-            </w:r>
-          </w:p>
-        </w:tc>
-        <w:tc>
-          <w:tcPr>
-            <w:tcW w:w="8760" w:type="dxa"/>
-            <w:tcBorders>
-              <w:top w:val="single" w:sz="1" w:space="0" w:color="CCCCCC"/>
-              <w:left w:val="single" w:sz="1" w:space="0" w:color="CCCCCC"/>
-              <w:bottom w:val="single" w:sz="1" w:space="0" w:color="CCCCCC"/>
-              <w:right w:val="single" w:sz="1" w:space="0" w:color="CCCCCC"/>
-            </w:tcBorders>
-            <w:shd w:val="clear" w:color="auto" w:fill="FFFFFF"/>
-            <w:tcMar>
-              <w:top w:w="60" w:type="dxa"/>
-              <w:left w:w="120" w:type="dxa"/>
-              <w:bottom w:w="60" w:type="dxa"/>
-              <w:right w:w="120" w:type="dxa"/>
-            </w:tcMar>
-          </w:tcPr>
-          <w:p>
-            <w:r>
-              <w:t>Retain existing static covariates: geographic metadata, bike specs, dealer IDs</w:t>
-            </w:r>
-          </w:p>
-        </w:tc>
-      </w:tr>
-      <w:tr>
-        <w:tblPrEx>
-          <w:tblCellMar>
-            <w:top w:w="0" w:type="dxa"/>
-            <w:bottom w:w="0" w:type="dxa"/>
-          </w:tblCellMar>
-        </w:tblPrEx>
-        <w:tc>
-          <w:tcPr>
-            <w:tcW w:w="600" w:type="dxa"/>
-            <w:tcBorders>
-              <w:top w:val="single" w:sz="1" w:space="0" w:color="CCCCCC"/>
-              <w:left w:val="single" w:sz="1" w:space="0" w:color="CCCCCC"/>
-              <w:bottom w:val="single" w:sz="1" w:space="0" w:color="CCCCCC"/>
-              <w:right w:val="single" w:sz="1" w:space="0" w:color="CCCCCC"/>
-            </w:tcBorders>
-            <w:shd w:val="clear" w:color="auto" w:fill="FFFFFF"/>
-            <w:tcMar>
-              <w:top w:w="60" w:type="dxa"/>
-              <w:left w:w="100" w:type="dxa"/>
-              <w:bottom w:w="60" w:type="dxa"/>
-              <w:right w:w="100" w:type="dxa"/>
-            </w:tcMar>
-            <w:vAlign w:val="center"/>
-          </w:tcPr>
-          <w:p>
-            <w:pPr>
-              <w:jc w:val="center"/>
-            </w:pPr>
-            <w:r>
-              <w:rPr>
-                <w:sz w:val="22"/>
-                <w:szCs w:val="22"/>
-              </w:rPr>
-              <w:t>☐</w:t>
-            </w:r>
-          </w:p>
-        </w:tc>
-        <w:tc>
-          <w:tcPr>
-            <w:tcW w:w="8760" w:type="dxa"/>
-            <w:tcBorders>
-              <w:top w:val="single" w:sz="1" w:space="0" w:color="CCCCCC"/>
-              <w:left w:val="single" w:sz="1" w:space="0" w:color="CCCCCC"/>
-              <w:bottom w:val="single" w:sz="1" w:space="0" w:color="CCCCCC"/>
-              <w:right w:val="single" w:sz="1" w:space="0" w:color="CCCCCC"/>
-            </w:tcBorders>
-            <w:shd w:val="clear" w:color="auto" w:fill="FFFFFF"/>
-            <w:tcMar>
-              <w:top w:w="60" w:type="dxa"/>
-              <w:left w:w="120" w:type="dxa"/>
-              <w:bottom w:w="60" w:type="dxa"/>
-              <w:right w:w="120" w:type="dxa"/>
-            </w:tcMar>
-          </w:tcPr>
-          <w:p>
-            <w:r>
-              <w:t>Verify covariate coverage extends through the full forecast horizon (Mar'26)</w:t>
-            </w:r>
-          </w:p>
-        </w:tc>
-      </w:tr>
-      <w:tr>
-        <w:tblPrEx>
-          <w:tblCellMar>
-            <w:top w:w="0" w:type="dxa"/>
-            <w:bottom w:w="0" w:type="dxa"/>
-          </w:tblCellMar>
-        </w:tblPrEx>
         <w:tc>
           <w:tcPr>
             <w:tcW w:w="9360" w:type="dxa"/>
@@ -1419,7 +2119,7 @@
               <w:bottom w:val="single" w:sz="1" w:space="0" w:color="CCCCCC"/>
               <w:right w:val="single" w:sz="1" w:space="0" w:color="CCCCCC"/>
             </w:tcBorders>
-            <w:shd w:val="clear" w:color="auto" w:fill="2E75B6"/>
+            <w:shd w:val="clear" w:color="auto" w:fill="1F4E79"/>
             <w:tcMar>
               <w:top w:w="80" w:type="dxa"/>
               <w:left w:w="140" w:type="dxa"/>
@@ -1436,18 +2136,12 @@
                 <w:sz w:val="22"/>
                 <w:szCs w:val="22"/>
               </w:rPr>
-              <w:t>Phase 3 — Model Training</w:t>
+              <w:t>Phase 4 — Forecasting &amp; Evaluation</w:t>
             </w:r>
           </w:p>
         </w:tc>
       </w:tr>
       <w:tr>
-        <w:tblPrEx>
-          <w:tblCellMar>
-            <w:top w:w="0" w:type="dxa"/>
-            <w:bottom w:w="0" w:type="dxa"/>
-          </w:tblCellMar>
-        </w:tblPrEx>
         <w:tc>
           <w:tcPr>
             <w:tcW w:w="600" w:type="dxa"/>
@@ -1498,18 +2192,12 @@
           </w:tcPr>
           <w:p>
             <w:r>
-              <w:t>Configure Darts TFT with architecture from overfitting test (hidden size, LSTM layers, attention heads)</w:t>
+              <w:t>Generate forecast for Mar'26 using the best saved checkpoint</w:t>
             </w:r>
           </w:p>
         </w:tc>
       </w:tr>
       <w:tr>
-        <w:tblPrEx>
-          <w:tblCellMar>
-            <w:top w:w="0" w:type="dxa"/>
-            <w:bottom w:w="0" w:type="dxa"/>
-          </w:tblCellMar>
-        </w:tblPrEx>
         <w:tc>
           <w:tcPr>
             <w:tcW w:w="600" w:type="dxa"/>
@@ -1537,7 +2225,6 @@
                 <w:sz w:val="22"/>
                 <w:szCs w:val="22"/>
               </w:rPr>
-              <w:lastRenderedPageBreak/>
               <w:t>☐</w:t>
             </w:r>
           </w:p>
@@ -1561,18 +2248,12 @@
           </w:tcPr>
           <w:p>
             <w:r>
-              <w:t>Set learning rate to ~0.0003 (validated in overfitting test with holiday covariates)</w:t>
+              <w:t>Pull actuals for Mar'26 from source table</w:t>
             </w:r>
           </w:p>
         </w:tc>
       </w:tr>
       <w:tr>
-        <w:tblPrEx>
-          <w:tblCellMar>
-            <w:top w:w="0" w:type="dxa"/>
-            <w:bottom w:w="0" w:type="dxa"/>
-          </w:tblCellMar>
-        </w:tblPrEx>
         <w:tc>
           <w:tcPr>
             <w:tcW w:w="600" w:type="dxa"/>
@@ -1623,26 +2304,12 @@
           </w:tcPr>
           <w:p>
             <w:r>
-              <w:t xml:space="preserve">Enable </w:t>
-            </w:r>
-            <w:proofErr w:type="spellStart"/>
-            <w:r>
-              <w:t>AdamW</w:t>
-            </w:r>
-            <w:proofErr w:type="spellEnd"/>
-            <w:r>
-              <w:t xml:space="preserve"> optimizer and Early Stopping (as validated in overfitting test)</w:t>
+              <w:t>Compute forecast accuracy metrics vs Mar'26 actuals (e.g. MAPE, WAPE, RMSE per series)</w:t>
             </w:r>
           </w:p>
         </w:tc>
       </w:tr>
       <w:tr>
-        <w:tblPrEx>
-          <w:tblCellMar>
-            <w:top w:w="0" w:type="dxa"/>
-            <w:bottom w:w="0" w:type="dxa"/>
-          </w:tblCellMar>
-        </w:tblPrEx>
         <w:tc>
           <w:tcPr>
             <w:tcW w:w="600" w:type="dxa"/>
@@ -1693,18 +2360,12 @@
           </w:tcPr>
           <w:p>
             <w:r>
-              <w:t>Train model on filtered series with all covariates including GST indicator</w:t>
+              <w:t>Pull Snowflake ML Forecast predictions for the same series for Mar'26</w:t>
             </w:r>
           </w:p>
         </w:tc>
       </w:tr>
       <w:tr>
-        <w:tblPrEx>
-          <w:tblCellMar>
-            <w:top w:w="0" w:type="dxa"/>
-            <w:bottom w:w="0" w:type="dxa"/>
-          </w:tblCellMar>
-        </w:tblPrEx>
         <w:tc>
           <w:tcPr>
             <w:tcW w:w="600" w:type="dxa"/>
@@ -1755,49 +2416,12 @@
           </w:tcPr>
           <w:p>
             <w:r>
-              <w:t xml:space="preserve">Monitor </w:t>
-            </w:r>
-            <w:proofErr w:type="spellStart"/>
-            <w:r>
-              <w:t>tr</w:t>
-            </w:r>
-            <w:r>
-              <w:t>ain_loss</w:t>
-            </w:r>
-            <w:proofErr w:type="spellEnd"/>
-            <w:r>
-              <w:t xml:space="preserve"> and </w:t>
-            </w:r>
-            <w:proofErr w:type="spellStart"/>
-            <w:r>
-              <w:t>val_loss</w:t>
-            </w:r>
-            <w:proofErr w:type="spellEnd"/>
-            <w:r>
-              <w:t xml:space="preserve"> — ensure both decrease together; watch for widening gap (overfitting signal)</w:t>
-            </w:r>
-          </w:p>
-          <w:p>
-            <w:r>
-              <w:rPr>
-                <w:i/>
-                <w:iCs/>
-                <w:color w:val="888888"/>
-                <w:sz w:val="17"/>
-                <w:szCs w:val="17"/>
-              </w:rPr>
-              <w:t>Val loss may be elevated due to anomalous Dec'25–Feb'26 window — interpret with care</w:t>
+              <w:t>Compare TFT forecast vs Snowflake ML Forecast on the same accuracy metrics</w:t>
             </w:r>
           </w:p>
         </w:tc>
       </w:tr>
       <w:tr>
-        <w:tblPrEx>
-          <w:tblCellMar>
-            <w:top w:w="0" w:type="dxa"/>
-            <w:bottom w:w="0" w:type="dxa"/>
-          </w:tblCellMar>
-        </w:tblPrEx>
         <w:tc>
           <w:tcPr>
             <w:tcW w:w="600" w:type="dxa"/>
@@ -1848,26 +2472,68 @@
           </w:tcPr>
           <w:p>
             <w:r>
-              <w:t xml:space="preserve">Save best checkpoint (lowest </w:t>
-            </w:r>
-            <w:proofErr w:type="spellStart"/>
-            <w:r>
-              <w:t>val_loss</w:t>
-            </w:r>
-            <w:proofErr w:type="spellEnd"/>
-            <w:r>
-              <w:t xml:space="preserve"> epoch)</w:t>
+              <w:t>Identify series where TFT outperforms Snowflake and vice versa</w:t>
             </w:r>
           </w:p>
         </w:tc>
       </w:tr>
       <w:tr>
-        <w:tblPrEx>
-          <w:tblCellMar>
-            <w:top w:w="0" w:type="dxa"/>
-            <w:bottom w:w="0" w:type="dxa"/>
-          </w:tblCellMar>
-        </w:tblPrEx>
+        <w:tc>
+          <w:tcPr>
+            <w:tcW w:w="600" w:type="dxa"/>
+            <w:tcBorders>
+              <w:top w:val="single" w:sz="1" w:space="0" w:color="CCCCCC"/>
+              <w:left w:val="single" w:sz="1" w:space="0" w:color="CCCCCC"/>
+              <w:bottom w:val="single" w:sz="1" w:space="0" w:color="CCCCCC"/>
+              <w:right w:val="single" w:sz="1" w:space="0" w:color="CCCCCC"/>
+            </w:tcBorders>
+            <w:shd w:val="clear" w:color="auto" w:fill="FFFFFF"/>
+            <w:tcMar>
+              <w:top w:w="60" w:type="dxa"/>
+              <w:left w:w="100" w:type="dxa"/>
+              <w:bottom w:w="60" w:type="dxa"/>
+              <w:right w:w="100" w:type="dxa"/>
+            </w:tcMar>
+            <w:vAlign w:val="center"/>
+          </w:tcPr>
+          <w:p>
+            <w:pPr>
+              <w:jc w:val="center"/>
+            </w:pPr>
+            <w:r>
+              <w:rPr>
+                <w:sz w:val="22"/>
+                <w:szCs w:val="22"/>
+              </w:rPr>
+              <w:t>☐</w:t>
+            </w:r>
+          </w:p>
+        </w:tc>
+        <w:tc>
+          <w:tcPr>
+            <w:tcW w:w="8760" w:type="dxa"/>
+            <w:tcBorders>
+              <w:top w:val="single" w:sz="1" w:space="0" w:color="CCCCCC"/>
+              <w:left w:val="single" w:sz="1" w:space="0" w:color="CCCCCC"/>
+              <w:bottom w:val="single" w:sz="1" w:space="0" w:color="CCCCCC"/>
+              <w:right w:val="single" w:sz="1" w:space="0" w:color="CCCCCC"/>
+            </w:tcBorders>
+            <w:shd w:val="clear" w:color="auto" w:fill="FFFFFF"/>
+            <w:tcMar>
+              <w:top w:w="60" w:type="dxa"/>
+              <w:left w:w="120" w:type="dxa"/>
+              <w:bottom w:w="60" w:type="dxa"/>
+              <w:right w:w="120" w:type="dxa"/>
+            </w:tcMar>
+          </w:tcPr>
+          <w:p>
+            <w:r>
+              <w:t>Document findings and summarise overall accuracy improvement / delta</w:t>
+            </w:r>
+          </w:p>
+        </w:tc>
+      </w:tr>
+      <w:tr>
         <w:tc>
           <w:tcPr>
             <w:tcW w:w="9360" w:type="dxa"/>
@@ -1878,7 +2544,7 @@
               <w:bottom w:val="single" w:sz="1" w:space="0" w:color="CCCCCC"/>
               <w:right w:val="single" w:sz="1" w:space="0" w:color="CCCCCC"/>
             </w:tcBorders>
-            <w:shd w:val="clear" w:color="auto" w:fill="1F4E79"/>
+            <w:shd w:val="clear" w:color="auto" w:fill="375623"/>
             <w:tcMar>
               <w:top w:w="80" w:type="dxa"/>
               <w:left w:w="140" w:type="dxa"/>
@@ -1895,18 +2561,12 @@
                 <w:sz w:val="22"/>
                 <w:szCs w:val="22"/>
               </w:rPr>
-              <w:t>Phase 4 — Forecasting &amp; Evaluation</w:t>
+              <w:t>Phase 5 — Results Packaging for Manager</w:t>
             </w:r>
           </w:p>
         </w:tc>
       </w:tr>
       <w:tr>
-        <w:tblPrEx>
-          <w:tblCellMar>
-            <w:top w:w="0" w:type="dxa"/>
-            <w:bottom w:w="0" w:type="dxa"/>
-          </w:tblCellMar>
-        </w:tblPrEx>
         <w:tc>
           <w:tcPr>
             <w:tcW w:w="600" w:type="dxa"/>
@@ -1957,18 +2617,20 @@
           </w:tcPr>
           <w:p>
             <w:r>
-              <w:t>Generate forecast for Mar'26 using the best saved checkpoint</w:t>
+              <w:t xml:space="preserve">Prepare summary table: series count, train period, </w:t>
+            </w:r>
+            <w:proofErr w:type="spellStart"/>
+            <w:r>
+              <w:t>val</w:t>
+            </w:r>
+            <w:proofErr w:type="spellEnd"/>
+            <w:r>
+              <w:t xml:space="preserve"> period, test period, GST covariate used</w:t>
             </w:r>
           </w:p>
         </w:tc>
       </w:tr>
       <w:tr>
-        <w:tblPrEx>
-          <w:tblCellMar>
-            <w:top w:w="0" w:type="dxa"/>
-            <w:bottom w:w="0" w:type="dxa"/>
-          </w:tblCellMar>
-        </w:tblPrEx>
         <w:tc>
           <w:tcPr>
             <w:tcW w:w="600" w:type="dxa"/>
@@ -2019,18 +2681,12 @@
           </w:tcPr>
           <w:p>
             <w:r>
-              <w:t>Pull actuals for Mar'26 from source table</w:t>
+              <w:t>Prepare metric comparison table: TFT vs Snowflake — MAPE / WAPE / RMSE</w:t>
             </w:r>
           </w:p>
         </w:tc>
       </w:tr>
       <w:tr>
-        <w:tblPrEx>
-          <w:tblCellMar>
-            <w:top w:w="0" w:type="dxa"/>
-            <w:bottom w:w="0" w:type="dxa"/>
-          </w:tblCellMar>
-        </w:tblPrEx>
         <w:tc>
           <w:tcPr>
             <w:tcW w:w="600" w:type="dxa"/>
@@ -2081,18 +2737,28 @@
           </w:tcPr>
           <w:p>
             <w:r>
-              <w:t>Compute forecast accuracy metrics vs Mar'26 actuals (e.g. MAPE, WAPE, RMSE per series)</w:t>
+              <w:t xml:space="preserve">Add </w:t>
+            </w:r>
+            <w:proofErr w:type="spellStart"/>
+            <w:r>
+              <w:t>train_loss</w:t>
+            </w:r>
+            <w:proofErr w:type="spellEnd"/>
+            <w:r>
+              <w:t xml:space="preserve"> and </w:t>
+            </w:r>
+            <w:proofErr w:type="spellStart"/>
+            <w:r>
+              <w:t>val_loss</w:t>
+            </w:r>
+            <w:proofErr w:type="spellEnd"/>
+            <w:r>
+              <w:t xml:space="preserve"> curve chart to results</w:t>
             </w:r>
           </w:p>
         </w:tc>
       </w:tr>
       <w:tr>
-        <w:tblPrEx>
-          <w:tblCellMar>
-            <w:top w:w="0" w:type="dxa"/>
-            <w:bottom w:w="0" w:type="dxa"/>
-          </w:tblCellMar>
-        </w:tblPrEx>
         <w:tc>
           <w:tcPr>
             <w:tcW w:w="600" w:type="dxa"/>
@@ -2143,18 +2809,20 @@
           </w:tcPr>
           <w:p>
             <w:r>
-              <w:t>Pull Snowflake ML Forecast predictions for the same series for Mar'26</w:t>
+              <w:t xml:space="preserve">Note anomaly context: GST impact on Oct'25 onwards, effect on </w:t>
+            </w:r>
+            <w:proofErr w:type="spellStart"/>
+            <w:r>
+              <w:t>val</w:t>
+            </w:r>
+            <w:proofErr w:type="spellEnd"/>
+            <w:r>
+              <w:t xml:space="preserve"> and test interpretation</w:t>
             </w:r>
           </w:p>
         </w:tc>
       </w:tr>
       <w:tr>
-        <w:tblPrEx>
-          <w:tblCellMar>
-            <w:top w:w="0" w:type="dxa"/>
-            <w:bottom w:w="0" w:type="dxa"/>
-          </w:tblCellMar>
-        </w:tblPrEx>
         <w:tc>
           <w:tcPr>
             <w:tcW w:w="600" w:type="dxa"/>
@@ -2205,534 +2873,20 @@
           </w:tcPr>
           <w:p>
             <w:r>
-              <w:t>Compare TFT forecast vs Snowflake ML Forecast on the same accuracy metrics</w:t>
+              <w:t>Document next steps: marketing data integration, industry volume data (</w:t>
+            </w:r>
+            <w:proofErr w:type="spellStart"/>
+            <w:r>
+              <w:t>Vahan</w:t>
+            </w:r>
+            <w:proofErr w:type="spellEnd"/>
+            <w:r>
+              <w:t xml:space="preserve"> portal)</w:t>
             </w:r>
           </w:p>
         </w:tc>
       </w:tr>
       <w:tr>
-        <w:tblPrEx>
-          <w:tblCellMar>
-            <w:top w:w="0" w:type="dxa"/>
-            <w:bottom w:w="0" w:type="dxa"/>
-          </w:tblCellMar>
-        </w:tblPrEx>
-        <w:tc>
-          <w:tcPr>
-            <w:tcW w:w="600" w:type="dxa"/>
-            <w:tcBorders>
-              <w:top w:val="single" w:sz="1" w:space="0" w:color="CCCCCC"/>
-              <w:left w:val="single" w:sz="1" w:space="0" w:color="CCCCCC"/>
-              <w:bottom w:val="single" w:sz="1" w:space="0" w:color="CCCCCC"/>
-              <w:right w:val="single" w:sz="1" w:space="0" w:color="CCCCCC"/>
-            </w:tcBorders>
-            <w:shd w:val="clear" w:color="auto" w:fill="FFFFFF"/>
-            <w:tcMar>
-              <w:top w:w="60" w:type="dxa"/>
-              <w:left w:w="100" w:type="dxa"/>
-              <w:bottom w:w="60" w:type="dxa"/>
-              <w:right w:w="100" w:type="dxa"/>
-            </w:tcMar>
-            <w:vAlign w:val="center"/>
-          </w:tcPr>
-          <w:p>
-            <w:pPr>
-              <w:jc w:val="center"/>
-            </w:pPr>
-            <w:r>
-              <w:rPr>
-                <w:sz w:val="22"/>
-                <w:szCs w:val="22"/>
-              </w:rPr>
-              <w:t>☐</w:t>
-            </w:r>
-          </w:p>
-        </w:tc>
-        <w:tc>
-          <w:tcPr>
-            <w:tcW w:w="8760" w:type="dxa"/>
-            <w:tcBorders>
-              <w:top w:val="single" w:sz="1" w:space="0" w:color="CCCCCC"/>
-              <w:left w:val="single" w:sz="1" w:space="0" w:color="CCCCCC"/>
-              <w:bottom w:val="single" w:sz="1" w:space="0" w:color="CCCCCC"/>
-              <w:right w:val="single" w:sz="1" w:space="0" w:color="CCCCCC"/>
-            </w:tcBorders>
-            <w:shd w:val="clear" w:color="auto" w:fill="FFFFFF"/>
-            <w:tcMar>
-              <w:top w:w="60" w:type="dxa"/>
-              <w:left w:w="120" w:type="dxa"/>
-              <w:bottom w:w="60" w:type="dxa"/>
-              <w:right w:w="120" w:type="dxa"/>
-            </w:tcMar>
-          </w:tcPr>
-          <w:p>
-            <w:r>
-              <w:t>Identify series where TFT outperforms Snowflake and vice versa</w:t>
-            </w:r>
-          </w:p>
-        </w:tc>
-      </w:tr>
-      <w:tr>
-        <w:tblPrEx>
-          <w:tblCellMar>
-            <w:top w:w="0" w:type="dxa"/>
-            <w:bottom w:w="0" w:type="dxa"/>
-          </w:tblCellMar>
-        </w:tblPrEx>
-        <w:tc>
-          <w:tcPr>
-            <w:tcW w:w="600" w:type="dxa"/>
-            <w:tcBorders>
-              <w:top w:val="single" w:sz="1" w:space="0" w:color="CCCCCC"/>
-              <w:left w:val="single" w:sz="1" w:space="0" w:color="CCCCCC"/>
-              <w:bottom w:val="single" w:sz="1" w:space="0" w:color="CCCCCC"/>
-              <w:right w:val="single" w:sz="1" w:space="0" w:color="CCCCCC"/>
-            </w:tcBorders>
-            <w:shd w:val="clear" w:color="auto" w:fill="FFFFFF"/>
-            <w:tcMar>
-              <w:top w:w="60" w:type="dxa"/>
-              <w:left w:w="100" w:type="dxa"/>
-              <w:bottom w:w="60" w:type="dxa"/>
-              <w:right w:w="100" w:type="dxa"/>
-            </w:tcMar>
-            <w:vAlign w:val="center"/>
-          </w:tcPr>
-          <w:p>
-            <w:pPr>
-              <w:jc w:val="center"/>
-            </w:pPr>
-            <w:r>
-              <w:rPr>
-                <w:sz w:val="22"/>
-                <w:szCs w:val="22"/>
-              </w:rPr>
-              <w:t>☐</w:t>
-            </w:r>
-          </w:p>
-        </w:tc>
-        <w:tc>
-          <w:tcPr>
-            <w:tcW w:w="8760" w:type="dxa"/>
-            <w:tcBorders>
-              <w:top w:val="single" w:sz="1" w:space="0" w:color="CCCCCC"/>
-              <w:left w:val="single" w:sz="1" w:space="0" w:color="CCCCCC"/>
-              <w:bottom w:val="single" w:sz="1" w:space="0" w:color="CCCCCC"/>
-              <w:right w:val="single" w:sz="1" w:space="0" w:color="CCCCCC"/>
-            </w:tcBorders>
-            <w:shd w:val="clear" w:color="auto" w:fill="FFFFFF"/>
-            <w:tcMar>
-              <w:top w:w="60" w:type="dxa"/>
-              <w:left w:w="120" w:type="dxa"/>
-              <w:bottom w:w="60" w:type="dxa"/>
-              <w:right w:w="120" w:type="dxa"/>
-            </w:tcMar>
-          </w:tcPr>
-          <w:p>
-            <w:r>
-              <w:t>Document findings and summarise overall accuracy improvement / delta</w:t>
-            </w:r>
-          </w:p>
-        </w:tc>
-      </w:tr>
-      <w:tr>
-        <w:tblPrEx>
-          <w:tblCellMar>
-            <w:top w:w="0" w:type="dxa"/>
-            <w:bottom w:w="0" w:type="dxa"/>
-          </w:tblCellMar>
-        </w:tblPrEx>
-        <w:tc>
-          <w:tcPr>
-            <w:tcW w:w="9360" w:type="dxa"/>
-            <w:gridSpan w:val="2"/>
-            <w:tcBorders>
-              <w:top w:val="single" w:sz="1" w:space="0" w:color="CCCCCC"/>
-              <w:left w:val="single" w:sz="1" w:space="0" w:color="CCCCCC"/>
-              <w:bottom w:val="single" w:sz="1" w:space="0" w:color="CCCCCC"/>
-              <w:right w:val="single" w:sz="1" w:space="0" w:color="CCCCCC"/>
-            </w:tcBorders>
-            <w:shd w:val="clear" w:color="auto" w:fill="375623"/>
-            <w:tcMar>
-              <w:top w:w="80" w:type="dxa"/>
-              <w:left w:w="140" w:type="dxa"/>
-              <w:bottom w:w="80" w:type="dxa"/>
-              <w:right w:w="140" w:type="dxa"/>
-            </w:tcMar>
-          </w:tcPr>
-          <w:p>
-            <w:r>
-              <w:rPr>
-                <w:b/>
-                <w:bCs/>
-                <w:color w:val="FFFFFF"/>
-                <w:sz w:val="22"/>
-                <w:szCs w:val="22"/>
-              </w:rPr>
-              <w:t>Phase 5 — Results Packaging for Manager</w:t>
-            </w:r>
-          </w:p>
-        </w:tc>
-      </w:tr>
-      <w:tr>
-        <w:tblPrEx>
-          <w:tblCellMar>
-            <w:top w:w="0" w:type="dxa"/>
-            <w:bottom w:w="0" w:type="dxa"/>
-          </w:tblCellMar>
-        </w:tblPrEx>
-        <w:tc>
-          <w:tcPr>
-            <w:tcW w:w="600" w:type="dxa"/>
-            <w:tcBorders>
-              <w:top w:val="single" w:sz="1" w:space="0" w:color="CCCCCC"/>
-              <w:left w:val="single" w:sz="1" w:space="0" w:color="CCCCCC"/>
-              <w:bottom w:val="single" w:sz="1" w:space="0" w:color="CCCCCC"/>
-              <w:right w:val="single" w:sz="1" w:space="0" w:color="CCCCCC"/>
-            </w:tcBorders>
-            <w:shd w:val="clear" w:color="auto" w:fill="FFFFFF"/>
-            <w:tcMar>
-              <w:top w:w="60" w:type="dxa"/>
-              <w:left w:w="100" w:type="dxa"/>
-              <w:bottom w:w="60" w:type="dxa"/>
-              <w:right w:w="100" w:type="dxa"/>
-            </w:tcMar>
-            <w:vAlign w:val="center"/>
-          </w:tcPr>
-          <w:p>
-            <w:pPr>
-              <w:jc w:val="center"/>
-            </w:pPr>
-            <w:r>
-              <w:rPr>
-                <w:sz w:val="22"/>
-                <w:szCs w:val="22"/>
-              </w:rPr>
-              <w:t>☐</w:t>
-            </w:r>
-          </w:p>
-        </w:tc>
-        <w:tc>
-          <w:tcPr>
-            <w:tcW w:w="8760" w:type="dxa"/>
-            <w:tcBorders>
-              <w:top w:val="single" w:sz="1" w:space="0" w:color="CCCCCC"/>
-              <w:left w:val="single" w:sz="1" w:space="0" w:color="CCCCCC"/>
-              <w:bottom w:val="single" w:sz="1" w:space="0" w:color="CCCCCC"/>
-              <w:right w:val="single" w:sz="1" w:space="0" w:color="CCCCCC"/>
-            </w:tcBorders>
-            <w:shd w:val="clear" w:color="auto" w:fill="FFFFFF"/>
-            <w:tcMar>
-              <w:top w:w="60" w:type="dxa"/>
-              <w:left w:w="120" w:type="dxa"/>
-              <w:bottom w:w="60" w:type="dxa"/>
-              <w:right w:w="120" w:type="dxa"/>
-            </w:tcMar>
-          </w:tcPr>
-          <w:p>
-            <w:r>
-              <w:t xml:space="preserve">Prepare summary table: series count, train period, </w:t>
-            </w:r>
-            <w:proofErr w:type="spellStart"/>
-            <w:r>
-              <w:t>val</w:t>
-            </w:r>
-            <w:proofErr w:type="spellEnd"/>
-            <w:r>
-              <w:t xml:space="preserve"> period, test period, GST covariate used</w:t>
-            </w:r>
-          </w:p>
-        </w:tc>
-      </w:tr>
-      <w:tr>
-        <w:tblPrEx>
-          <w:tblCellMar>
-            <w:top w:w="0" w:type="dxa"/>
-            <w:bottom w:w="0" w:type="dxa"/>
-          </w:tblCellMar>
-        </w:tblPrEx>
-        <w:tc>
-          <w:tcPr>
-            <w:tcW w:w="600" w:type="dxa"/>
-            <w:tcBorders>
-              <w:top w:val="single" w:sz="1" w:space="0" w:color="CCCCCC"/>
-              <w:left w:val="single" w:sz="1" w:space="0" w:color="CCCCCC"/>
-              <w:bottom w:val="single" w:sz="1" w:space="0" w:color="CCCCCC"/>
-              <w:right w:val="single" w:sz="1" w:space="0" w:color="CCCCCC"/>
-            </w:tcBorders>
-            <w:shd w:val="clear" w:color="auto" w:fill="FFFFFF"/>
-            <w:tcMar>
-              <w:top w:w="60" w:type="dxa"/>
-              <w:left w:w="100" w:type="dxa"/>
-              <w:bottom w:w="60" w:type="dxa"/>
-              <w:right w:w="100" w:type="dxa"/>
-            </w:tcMar>
-            <w:vAlign w:val="center"/>
-          </w:tcPr>
-          <w:p>
-            <w:pPr>
-              <w:jc w:val="center"/>
-            </w:pPr>
-            <w:r>
-              <w:rPr>
-                <w:sz w:val="22"/>
-                <w:szCs w:val="22"/>
-              </w:rPr>
-              <w:t>☐</w:t>
-            </w:r>
-          </w:p>
-        </w:tc>
-        <w:tc>
-          <w:tcPr>
-            <w:tcW w:w="8760" w:type="dxa"/>
-            <w:tcBorders>
-              <w:top w:val="single" w:sz="1" w:space="0" w:color="CCCCCC"/>
-              <w:left w:val="single" w:sz="1" w:space="0" w:color="CCCCCC"/>
-              <w:bottom w:val="single" w:sz="1" w:space="0" w:color="CCCCCC"/>
-              <w:right w:val="single" w:sz="1" w:space="0" w:color="CCCCCC"/>
-            </w:tcBorders>
-            <w:shd w:val="clear" w:color="auto" w:fill="FFFFFF"/>
-            <w:tcMar>
-              <w:top w:w="60" w:type="dxa"/>
-              <w:left w:w="120" w:type="dxa"/>
-              <w:bottom w:w="60" w:type="dxa"/>
-              <w:right w:w="120" w:type="dxa"/>
-            </w:tcMar>
-          </w:tcPr>
-          <w:p>
-            <w:r>
-              <w:t>Prepare metric comparison table: TFT vs Snowflake — MAPE / WAPE / RMSE</w:t>
-            </w:r>
-          </w:p>
-        </w:tc>
-      </w:tr>
-      <w:tr>
-        <w:tblPrEx>
-          <w:tblCellMar>
-            <w:top w:w="0" w:type="dxa"/>
-            <w:bottom w:w="0" w:type="dxa"/>
-          </w:tblCellMar>
-        </w:tblPrEx>
-        <w:tc>
-          <w:tcPr>
-            <w:tcW w:w="600" w:type="dxa"/>
-            <w:tcBorders>
-              <w:top w:val="single" w:sz="1" w:space="0" w:color="CCCCCC"/>
-              <w:left w:val="single" w:sz="1" w:space="0" w:color="CCCCCC"/>
-              <w:bottom w:val="single" w:sz="1" w:space="0" w:color="CCCCCC"/>
-              <w:right w:val="single" w:sz="1" w:space="0" w:color="CCCCCC"/>
-            </w:tcBorders>
-            <w:shd w:val="clear" w:color="auto" w:fill="FFFFFF"/>
-            <w:tcMar>
-              <w:top w:w="60" w:type="dxa"/>
-              <w:left w:w="100" w:type="dxa"/>
-              <w:bottom w:w="60" w:type="dxa"/>
-              <w:right w:w="100" w:type="dxa"/>
-            </w:tcMar>
-            <w:vAlign w:val="center"/>
-          </w:tcPr>
-          <w:p>
-            <w:pPr>
-              <w:jc w:val="center"/>
-            </w:pPr>
-            <w:r>
-              <w:rPr>
-                <w:sz w:val="22"/>
-                <w:szCs w:val="22"/>
-              </w:rPr>
-              <w:t>☐</w:t>
-            </w:r>
-          </w:p>
-        </w:tc>
-        <w:tc>
-          <w:tcPr>
-            <w:tcW w:w="8760" w:type="dxa"/>
-            <w:tcBorders>
-              <w:top w:val="single" w:sz="1" w:space="0" w:color="CCCCCC"/>
-              <w:left w:val="single" w:sz="1" w:space="0" w:color="CCCCCC"/>
-              <w:bottom w:val="single" w:sz="1" w:space="0" w:color="CCCCCC"/>
-              <w:right w:val="single" w:sz="1" w:space="0" w:color="CCCCCC"/>
-            </w:tcBorders>
-            <w:shd w:val="clear" w:color="auto" w:fill="FFFFFF"/>
-            <w:tcMar>
-              <w:top w:w="60" w:type="dxa"/>
-              <w:left w:w="120" w:type="dxa"/>
-              <w:bottom w:w="60" w:type="dxa"/>
-              <w:right w:w="120" w:type="dxa"/>
-            </w:tcMar>
-          </w:tcPr>
-          <w:p>
-            <w:r>
-              <w:t xml:space="preserve">Add </w:t>
-            </w:r>
-            <w:proofErr w:type="spellStart"/>
-            <w:r>
-              <w:t>train_loss</w:t>
-            </w:r>
-            <w:proofErr w:type="spellEnd"/>
-            <w:r>
-              <w:t xml:space="preserve"> and </w:t>
-            </w:r>
-            <w:proofErr w:type="spellStart"/>
-            <w:r>
-              <w:t>val_loss</w:t>
-            </w:r>
-            <w:proofErr w:type="spellEnd"/>
-            <w:r>
-              <w:t xml:space="preserve"> curve chart to results</w:t>
-            </w:r>
-          </w:p>
-        </w:tc>
-      </w:tr>
-      <w:tr>
-        <w:tblPrEx>
-          <w:tblCellMar>
-            <w:top w:w="0" w:type="dxa"/>
-            <w:bottom w:w="0" w:type="dxa"/>
-          </w:tblCellMar>
-        </w:tblPrEx>
-        <w:tc>
-          <w:tcPr>
-            <w:tcW w:w="600" w:type="dxa"/>
-            <w:tcBorders>
-              <w:top w:val="single" w:sz="1" w:space="0" w:color="CCCCCC"/>
-              <w:left w:val="single" w:sz="1" w:space="0" w:color="CCCCCC"/>
-              <w:bottom w:val="single" w:sz="1" w:space="0" w:color="CCCCCC"/>
-              <w:right w:val="single" w:sz="1" w:space="0" w:color="CCCCCC"/>
-            </w:tcBorders>
-            <w:shd w:val="clear" w:color="auto" w:fill="FFFFFF"/>
-            <w:tcMar>
-              <w:top w:w="60" w:type="dxa"/>
-              <w:left w:w="100" w:type="dxa"/>
-              <w:bottom w:w="60" w:type="dxa"/>
-              <w:right w:w="100" w:type="dxa"/>
-            </w:tcMar>
-            <w:vAlign w:val="center"/>
-          </w:tcPr>
-          <w:p>
-            <w:pPr>
-              <w:jc w:val="center"/>
-            </w:pPr>
-            <w:r>
-              <w:rPr>
-                <w:sz w:val="22"/>
-                <w:szCs w:val="22"/>
-              </w:rPr>
-              <w:t>☐</w:t>
-            </w:r>
-          </w:p>
-        </w:tc>
-        <w:tc>
-          <w:tcPr>
-            <w:tcW w:w="8760" w:type="dxa"/>
-            <w:tcBorders>
-              <w:top w:val="single" w:sz="1" w:space="0" w:color="CCCCCC"/>
-              <w:left w:val="single" w:sz="1" w:space="0" w:color="CCCCCC"/>
-              <w:bottom w:val="single" w:sz="1" w:space="0" w:color="CCCCCC"/>
-              <w:right w:val="single" w:sz="1" w:space="0" w:color="CCCCCC"/>
-            </w:tcBorders>
-            <w:shd w:val="clear" w:color="auto" w:fill="FFFFFF"/>
-            <w:tcMar>
-              <w:top w:w="60" w:type="dxa"/>
-              <w:left w:w="120" w:type="dxa"/>
-              <w:bottom w:w="60" w:type="dxa"/>
-              <w:right w:w="120" w:type="dxa"/>
-            </w:tcMar>
-          </w:tcPr>
-          <w:p>
-            <w:r>
-              <w:t xml:space="preserve">Note anomaly context: GST impact on Oct'25 onwards, effect on </w:t>
-            </w:r>
-            <w:proofErr w:type="spellStart"/>
-            <w:r>
-              <w:t>val</w:t>
-            </w:r>
-            <w:proofErr w:type="spellEnd"/>
-            <w:r>
-              <w:t xml:space="preserve"> and test interpretation</w:t>
-            </w:r>
-          </w:p>
-        </w:tc>
-      </w:tr>
-      <w:tr>
-        <w:tblPrEx>
-          <w:tblCellMar>
-            <w:top w:w="0" w:type="dxa"/>
-            <w:bottom w:w="0" w:type="dxa"/>
-          </w:tblCellMar>
-        </w:tblPrEx>
-        <w:tc>
-          <w:tcPr>
-            <w:tcW w:w="600" w:type="dxa"/>
-            <w:tcBorders>
-              <w:top w:val="single" w:sz="1" w:space="0" w:color="CCCCCC"/>
-              <w:left w:val="single" w:sz="1" w:space="0" w:color="CCCCCC"/>
-              <w:bottom w:val="single" w:sz="1" w:space="0" w:color="CCCCCC"/>
-              <w:right w:val="single" w:sz="1" w:space="0" w:color="CCCCCC"/>
-            </w:tcBorders>
-            <w:shd w:val="clear" w:color="auto" w:fill="FFFFFF"/>
-            <w:tcMar>
-              <w:top w:w="60" w:type="dxa"/>
-              <w:left w:w="100" w:type="dxa"/>
-              <w:bottom w:w="60" w:type="dxa"/>
-              <w:right w:w="100" w:type="dxa"/>
-            </w:tcMar>
-            <w:vAlign w:val="center"/>
-          </w:tcPr>
-          <w:p>
-            <w:pPr>
-              <w:jc w:val="center"/>
-            </w:pPr>
-            <w:r>
-              <w:rPr>
-                <w:sz w:val="22"/>
-                <w:szCs w:val="22"/>
-              </w:rPr>
-              <w:t>☐</w:t>
-            </w:r>
-          </w:p>
-        </w:tc>
-        <w:tc>
-          <w:tcPr>
-            <w:tcW w:w="8760" w:type="dxa"/>
-            <w:tcBorders>
-              <w:top w:val="single" w:sz="1" w:space="0" w:color="CCCCCC"/>
-              <w:left w:val="single" w:sz="1" w:space="0" w:color="CCCCCC"/>
-              <w:bottom w:val="single" w:sz="1" w:space="0" w:color="CCCCCC"/>
-              <w:right w:val="single" w:sz="1" w:space="0" w:color="CCCCCC"/>
-            </w:tcBorders>
-            <w:shd w:val="clear" w:color="auto" w:fill="FFFFFF"/>
-            <w:tcMar>
-              <w:top w:w="60" w:type="dxa"/>
-              <w:left w:w="120" w:type="dxa"/>
-              <w:bottom w:w="60" w:type="dxa"/>
-              <w:right w:w="120" w:type="dxa"/>
-            </w:tcMar>
-          </w:tcPr>
-          <w:p>
-            <w:r>
-              <w:t>Document next steps: marketing data</w:t>
-            </w:r>
-            <w:r>
-              <w:t xml:space="preserve"> integration, industry volume data (</w:t>
-            </w:r>
-            <w:proofErr w:type="spellStart"/>
-            <w:r>
-              <w:t>Vahan</w:t>
-            </w:r>
-            <w:proofErr w:type="spellEnd"/>
-            <w:r>
-              <w:t xml:space="preserve"> portal)</w:t>
-            </w:r>
-          </w:p>
-        </w:tc>
-      </w:tr>
-      <w:tr>
-        <w:tblPrEx>
-          <w:tblCellMar>
-            <w:top w:w="0" w:type="dxa"/>
-            <w:bottom w:w="0" w:type="dxa"/>
-          </w:tblCellMar>
-        </w:tblPrEx>
         <w:tc>
           <w:tcPr>
             <w:tcW w:w="600" w:type="dxa"/>

</xml_diff>